<commit_message>
docs: réordonner les modules du devis et fusionner l'espace client
Nouvel ordre de développement (planning et comptes clients avancés,
contrat/facturation inversés) ; retrait de la tarification dégressive
(prix désormais fixes) ; fusion du module "Espace client en ligne"
dans "Comptes clients", enrichi du suivi d'avancement des locations en
cours (date de retrait, set concerné, statut, retard éventuel). Total
inchangé à 5 520 €.

Co-Authored-By: Claude Sonnet 5 <noreply@anthropic.com>
</commit_message>
<xml_diff>
--- a/docs/projet-plateforme-location/devis-set-et-brique.docx
+++ b/docs/projet-plateforme-location/devis-set-et-brique.docx
@@ -246,21 +246,6 @@
       </w:pPr>
       <w:r>
         <w:rPr/>
-        <w:t>Tarification dégressive selon la durée de location</w:t>
-      </w:r>
-    </w:p>
-    <w:p>
-      <w:pPr>
-        <w:pStyle w:val="ListParagraph"/>
-        <w:numPr>
-          <w:ilvl w:val="0"/>
-          <w:numId w:val="1"/>
-        </w:numPr>
-        <w:spacing w:before="0" w:after="60"/>
-        <w:rPr/>
-      </w:pPr>
-      <w:r>
-        <w:rPr/>
         <w:t>Définition du montant de caution par article</w:t>
       </w:r>
     </w:p>
@@ -307,7 +292,7 @@
           <w:sz w:val="24"/>
           <w:szCs w:val="24"/>
         </w:rPr>
-        <w:t>2. Comptes clients — données &amp; inscription</w:t>
+        <w:t>2. Planning des locations</w:t>
       </w:r>
       <w:r>
         <w:rPr>
@@ -317,6 +302,178 @@
           <w:sz w:val="24"/>
           <w:szCs w:val="24"/>
         </w:rPr>
+        <w:t xml:space="preserve">   —   660 €</w:t>
+      </w:r>
+    </w:p>
+    <w:p>
+      <w:pPr>
+        <w:pStyle w:val="ListParagraph"/>
+        <w:numPr>
+          <w:ilvl w:val="0"/>
+          <w:numId w:val="1"/>
+        </w:numPr>
+        <w:spacing w:before="0" w:after="60"/>
+        <w:rPr/>
+      </w:pPr>
+      <w:r>
+        <w:rPr/>
+        <w:t>Calendrier des périodes de location</w:t>
+      </w:r>
+    </w:p>
+    <w:p>
+      <w:pPr>
+        <w:pStyle w:val="ListParagraph"/>
+        <w:numPr>
+          <w:ilvl w:val="0"/>
+          <w:numId w:val="1"/>
+        </w:numPr>
+        <w:spacing w:before="0" w:after="60"/>
+        <w:rPr/>
+      </w:pPr>
+      <w:r>
+        <w:rPr/>
+        <w:t>Gestion des créneaux de retrait / retour</w:t>
+      </w:r>
+    </w:p>
+    <w:p>
+      <w:pPr>
+        <w:pStyle w:val="ListParagraph"/>
+        <w:numPr>
+          <w:ilvl w:val="0"/>
+          <w:numId w:val="1"/>
+        </w:numPr>
+        <w:spacing w:before="0" w:after="60"/>
+        <w:rPr/>
+      </w:pPr>
+      <w:r>
+        <w:rPr/>
+        <w:t>Disponibilité en temps réel des articles</w:t>
+      </w:r>
+    </w:p>
+    <w:p>
+      <w:pPr>
+        <w:pStyle w:val="Normal"/>
+        <w:spacing w:before="260" w:after="80"/>
+        <w:rPr/>
+      </w:pPr>
+      <w:r>
+        <w:rPr>
+          <w:b/>
+          <w:bCs/>
+          <w:sz w:val="24"/>
+          <w:szCs w:val="24"/>
+        </w:rPr>
+        <w:t>3. Comptes clients &amp; espace de suivi</w:t>
+      </w:r>
+      <w:r>
+        <w:rPr>
+          <w:b/>
+          <w:bCs/>
+          <w:color w:val="1F5C3B"/>
+          <w:sz w:val="24"/>
+          <w:szCs w:val="24"/>
+        </w:rPr>
+        <w:t xml:space="preserve">   —   660 €</w:t>
+      </w:r>
+    </w:p>
+    <w:p>
+      <w:pPr>
+        <w:pStyle w:val="ListParagraph"/>
+        <w:numPr>
+          <w:ilvl w:val="0"/>
+          <w:numId w:val="1"/>
+        </w:numPr>
+        <w:spacing w:before="0" w:after="60"/>
+        <w:rPr/>
+      </w:pPr>
+      <w:r>
+        <w:rPr/>
+        <w:t>Inscription client (coordonnées, contact)</w:t>
+      </w:r>
+    </w:p>
+    <w:p>
+      <w:pPr>
+        <w:pStyle w:val="ListParagraph"/>
+        <w:numPr>
+          <w:ilvl w:val="0"/>
+          <w:numId w:val="1"/>
+        </w:numPr>
+        <w:spacing w:before="0" w:after="60"/>
+        <w:rPr/>
+      </w:pPr>
+      <w:r>
+        <w:rPr/>
+        <w:t>Authentification de base (pour être reconnu lors d'une prochaine réservation, sans ressaisir ses informations)</w:t>
+      </w:r>
+    </w:p>
+    <w:p>
+      <w:pPr>
+        <w:pStyle w:val="ListParagraph"/>
+        <w:numPr>
+          <w:ilvl w:val="0"/>
+          <w:numId w:val="1"/>
+        </w:numPr>
+        <w:spacing w:before="0" w:after="60"/>
+        <w:rPr/>
+      </w:pPr>
+      <w:r>
+        <w:rPr/>
+        <w:t>Stockage des informations nécessaires à la facturation</w:t>
+      </w:r>
+    </w:p>
+    <w:p>
+      <w:pPr>
+        <w:pStyle w:val="ListParagraph"/>
+        <w:numPr>
+          <w:ilvl w:val="0"/>
+          <w:numId w:val="1"/>
+        </w:numPr>
+        <w:spacing w:before="0" w:after="60"/>
+        <w:rPr/>
+      </w:pPr>
+      <w:r>
+        <w:rPr/>
+        <w:t>Historique des locations rattaché à chaque client (consultable depuis le back-office)</w:t>
+      </w:r>
+    </w:p>
+    <w:p>
+      <w:pPr>
+        <w:pStyle w:val="ListParagraph"/>
+        <w:numPr>
+          <w:ilvl w:val="0"/>
+          <w:numId w:val="1"/>
+        </w:numPr>
+        <w:spacing w:before="0" w:after="60"/>
+        <w:rPr/>
+      </w:pPr>
+      <w:r>
+        <w:rPr/>
+        <w:t>Espace client en ligne : suivi de l'avancement de ses locations en cours (prochaine date de retrait, set concerné, statut récupéré / à rendre, date de retour prévue, retard éventuel)</w:t>
+      </w:r>
+    </w:p>
+    <w:p>
+      <w:pPr>
+        <w:pStyle w:val="Normal"/>
+        <w:spacing w:before="260" w:after="80"/>
+        <w:rPr/>
+      </w:pPr>
+      <w:r>
+        <w:rPr>
+          <w:b/>
+          <w:bCs/>
+          <w:sz w:val="24"/>
+          <w:szCs w:val="24"/>
+        </w:rPr>
+        <w:t>4. Paiement Stripe</w:t>
+      </w:r>
+      <w:r>
+        <w:rPr>
+          <w:b/>
+          <w:bCs/>
+          <w:color w:val="1F5C3B"/>
+          <w:sz w:val="24"/>
+          <w:szCs w:val="24"/>
+        </w:rPr>
         <w:t xml:space="preserve">   —   540 €</w:t>
       </w:r>
     </w:p>
@@ -332,52 +489,37 @@
       </w:pPr>
       <w:r>
         <w:rPr/>
-        <w:t>Inscription client (coordonnées, contact)</w:t>
-      </w:r>
-    </w:p>
-    <w:p>
-      <w:pPr>
-        <w:pStyle w:val="ListParagraph"/>
-        <w:numPr>
-          <w:ilvl w:val="0"/>
-          <w:numId w:val="1"/>
-        </w:numPr>
-        <w:spacing w:before="0" w:after="60"/>
-        <w:rPr/>
-      </w:pPr>
-      <w:r>
-        <w:rPr/>
-        <w:t>Authentification de base (pour être reconnu lors d'une prochaine réservation, sans ressaisir ses informations)</w:t>
-      </w:r>
-    </w:p>
-    <w:p>
-      <w:pPr>
-        <w:pStyle w:val="ListParagraph"/>
-        <w:numPr>
-          <w:ilvl w:val="0"/>
-          <w:numId w:val="1"/>
-        </w:numPr>
-        <w:spacing w:before="0" w:after="60"/>
-        <w:rPr/>
-      </w:pPr>
-      <w:r>
-        <w:rPr/>
-        <w:t>Stockage des informations nécessaires à la facturation</w:t>
-      </w:r>
-    </w:p>
-    <w:p>
-      <w:pPr>
-        <w:pStyle w:val="ListParagraph"/>
-        <w:numPr>
-          <w:ilvl w:val="0"/>
-          <w:numId w:val="1"/>
-        </w:numPr>
-        <w:spacing w:before="0" w:after="60"/>
-        <w:rPr/>
-      </w:pPr>
-      <w:r>
-        <w:rPr/>
-        <w:t>Historique des locations rattaché à chaque client (consultable depuis le back-office)</w:t>
+        <w:t>Intégration Stripe pour le règlement des locations</w:t>
+      </w:r>
+    </w:p>
+    <w:p>
+      <w:pPr>
+        <w:pStyle w:val="ListParagraph"/>
+        <w:numPr>
+          <w:ilvl w:val="0"/>
+          <w:numId w:val="1"/>
+        </w:numPr>
+        <w:spacing w:before="0" w:after="60"/>
+        <w:rPr/>
+      </w:pPr>
+      <w:r>
+        <w:rPr/>
+        <w:t>Gestion de la caution (pré-autorisation ou encaissement)</w:t>
+      </w:r>
+    </w:p>
+    <w:p>
+      <w:pPr>
+        <w:pStyle w:val="ListParagraph"/>
+        <w:numPr>
+          <w:ilvl w:val="0"/>
+          <w:numId w:val="1"/>
+        </w:numPr>
+        <w:spacing w:before="0" w:after="60"/>
+        <w:rPr/>
+      </w:pPr>
+      <w:r>
+        <w:rPr/>
+        <w:t>Option d'assurance / protection additionnelle</w:t>
       </w:r>
     </w:p>
     <w:p>
@@ -393,7 +535,7 @@
           <w:sz w:val="24"/>
           <w:szCs w:val="24"/>
         </w:rPr>
-        <w:t>3. Paiement Stripe</w:t>
+        <w:t>5. Tunnel de réservation client</w:t>
       </w:r>
       <w:r>
         <w:rPr>
@@ -403,52 +545,52 @@
           <w:sz w:val="24"/>
           <w:szCs w:val="24"/>
         </w:rPr>
-        <w:t xml:space="preserve">   —   540 €</w:t>
-      </w:r>
-    </w:p>
-    <w:p>
-      <w:pPr>
-        <w:pStyle w:val="ListParagraph"/>
-        <w:numPr>
-          <w:ilvl w:val="0"/>
-          <w:numId w:val="1"/>
-        </w:numPr>
-        <w:spacing w:before="0" w:after="60"/>
-        <w:rPr/>
-      </w:pPr>
-      <w:r>
-        <w:rPr/>
-        <w:t>Intégration Stripe pour le règlement des locations</w:t>
-      </w:r>
-    </w:p>
-    <w:p>
-      <w:pPr>
-        <w:pStyle w:val="ListParagraph"/>
-        <w:numPr>
-          <w:ilvl w:val="0"/>
-          <w:numId w:val="1"/>
-        </w:numPr>
-        <w:spacing w:before="0" w:after="60"/>
-        <w:rPr/>
-      </w:pPr>
-      <w:r>
-        <w:rPr/>
-        <w:t>Gestion de la caution (pré-autorisation ou encaissement)</w:t>
-      </w:r>
-    </w:p>
-    <w:p>
-      <w:pPr>
-        <w:pStyle w:val="ListParagraph"/>
-        <w:numPr>
-          <w:ilvl w:val="0"/>
-          <w:numId w:val="1"/>
-        </w:numPr>
-        <w:spacing w:before="0" w:after="60"/>
-        <w:rPr/>
-      </w:pPr>
-      <w:r>
-        <w:rPr/>
-        <w:t>Option d'assurance / protection additionnelle</w:t>
+        <w:t xml:space="preserve">   —   480 €</w:t>
+      </w:r>
+    </w:p>
+    <w:p>
+      <w:pPr>
+        <w:pStyle w:val="ListParagraph"/>
+        <w:numPr>
+          <w:ilvl w:val="0"/>
+          <w:numId w:val="1"/>
+        </w:numPr>
+        <w:spacing w:before="0" w:after="60"/>
+        <w:rPr/>
+      </w:pPr>
+      <w:r>
+        <w:rPr/>
+        <w:t>Parcours de réservation en ligne : sélection → durée → créneau → paiement</w:t>
+      </w:r>
+    </w:p>
+    <w:p>
+      <w:pPr>
+        <w:pStyle w:val="ListParagraph"/>
+        <w:numPr>
+          <w:ilvl w:val="0"/>
+          <w:numId w:val="1"/>
+        </w:numPr>
+        <w:spacing w:before="0" w:after="60"/>
+        <w:rPr/>
+      </w:pPr>
+      <w:r>
+        <w:rPr/>
+        <w:t>Intégration directe au site vitrine existant</w:t>
+      </w:r>
+    </w:p>
+    <w:p>
+      <w:pPr>
+        <w:pStyle w:val="ListParagraph"/>
+        <w:numPr>
+          <w:ilvl w:val="0"/>
+          <w:numId w:val="1"/>
+        </w:numPr>
+        <w:spacing w:before="0" w:after="60"/>
+        <w:rPr/>
+      </w:pPr>
+      <w:r>
+        <w:rPr/>
+        <w:t>Réutilise les composants déjà développés pour le planning et le catalogue (module allégé grâce à cette mutualisation)</w:t>
       </w:r>
     </w:p>
     <w:p>
@@ -464,7 +606,7 @@
           <w:sz w:val="24"/>
           <w:szCs w:val="24"/>
         </w:rPr>
-        <w:t>4. Planning des locations</w:t>
+        <w:t>6. Contrat de location / conditions générales</w:t>
       </w:r>
       <w:r>
         <w:rPr>
@@ -474,52 +616,37 @@
           <w:sz w:val="24"/>
           <w:szCs w:val="24"/>
         </w:rPr>
-        <w:t xml:space="preserve">   —   660 €</w:t>
-      </w:r>
-    </w:p>
-    <w:p>
-      <w:pPr>
-        <w:pStyle w:val="ListParagraph"/>
-        <w:numPr>
-          <w:ilvl w:val="0"/>
-          <w:numId w:val="1"/>
-        </w:numPr>
-        <w:spacing w:before="0" w:after="60"/>
-        <w:rPr/>
-      </w:pPr>
-      <w:r>
-        <w:rPr/>
-        <w:t>Calendrier des périodes de location</w:t>
-      </w:r>
-    </w:p>
-    <w:p>
-      <w:pPr>
-        <w:pStyle w:val="ListParagraph"/>
-        <w:numPr>
-          <w:ilvl w:val="0"/>
-          <w:numId w:val="1"/>
-        </w:numPr>
-        <w:spacing w:before="0" w:after="60"/>
-        <w:rPr/>
-      </w:pPr>
-      <w:r>
-        <w:rPr/>
-        <w:t>Gestion des créneaux de retrait / retour</w:t>
-      </w:r>
-    </w:p>
-    <w:p>
-      <w:pPr>
-        <w:pStyle w:val="ListParagraph"/>
-        <w:numPr>
-          <w:ilvl w:val="0"/>
-          <w:numId w:val="1"/>
-        </w:numPr>
-        <w:spacing w:before="0" w:after="60"/>
-        <w:rPr/>
-      </w:pPr>
-      <w:r>
-        <w:rPr/>
-        <w:t>Disponibilité en temps réel des articles</w:t>
+        <w:t xml:space="preserve">   —   300 €</w:t>
+      </w:r>
+    </w:p>
+    <w:p>
+      <w:pPr>
+        <w:pStyle w:val="ListParagraph"/>
+        <w:numPr>
+          <w:ilvl w:val="0"/>
+          <w:numId w:val="1"/>
+        </w:numPr>
+        <w:spacing w:before="0" w:after="60"/>
+        <w:rPr/>
+      </w:pPr>
+      <w:r>
+        <w:rPr/>
+        <w:t>Conditions générales de location intégrées au tunnel de réservation</w:t>
+      </w:r>
+    </w:p>
+    <w:p>
+      <w:pPr>
+        <w:pStyle w:val="ListParagraph"/>
+        <w:numPr>
+          <w:ilvl w:val="0"/>
+          <w:numId w:val="1"/>
+        </w:numPr>
+        <w:spacing w:before="0" w:after="60"/>
+        <w:rPr/>
+      </w:pPr>
+      <w:r>
+        <w:rPr/>
+        <w:t>Acceptation obligatoire avant validation de la commande</w:t>
       </w:r>
     </w:p>
     <w:p>
@@ -535,7 +662,7 @@
           <w:sz w:val="24"/>
           <w:szCs w:val="24"/>
         </w:rPr>
-        <w:t>5. Tunnel de réservation client</w:t>
+        <w:t>7. Facturation</w:t>
       </w:r>
       <w:r>
         <w:rPr>
@@ -545,52 +672,52 @@
           <w:sz w:val="24"/>
           <w:szCs w:val="24"/>
         </w:rPr>
-        <w:t xml:space="preserve">   —   480 €</w:t>
-      </w:r>
-    </w:p>
-    <w:p>
-      <w:pPr>
-        <w:pStyle w:val="ListParagraph"/>
-        <w:numPr>
-          <w:ilvl w:val="0"/>
-          <w:numId w:val="1"/>
-        </w:numPr>
-        <w:spacing w:before="0" w:after="60"/>
-        <w:rPr/>
-      </w:pPr>
-      <w:r>
-        <w:rPr/>
-        <w:t>Parcours de réservation en ligne : sélection → durée → créneau → paiement</w:t>
-      </w:r>
-    </w:p>
-    <w:p>
-      <w:pPr>
-        <w:pStyle w:val="ListParagraph"/>
-        <w:numPr>
-          <w:ilvl w:val="0"/>
-          <w:numId w:val="1"/>
-        </w:numPr>
-        <w:spacing w:before="0" w:after="60"/>
-        <w:rPr/>
-      </w:pPr>
-      <w:r>
-        <w:rPr/>
-        <w:t>Intégration directe au site vitrine existant</w:t>
-      </w:r>
-    </w:p>
-    <w:p>
-      <w:pPr>
-        <w:pStyle w:val="ListParagraph"/>
-        <w:numPr>
-          <w:ilvl w:val="0"/>
-          <w:numId w:val="1"/>
-        </w:numPr>
-        <w:spacing w:before="0" w:after="60"/>
-        <w:rPr/>
-      </w:pPr>
-      <w:r>
-        <w:rPr/>
-        <w:t>Réutilise les composants déjà développés pour le planning et le catalogue (module allégé grâce à cette mutualisation)</w:t>
+        <w:t xml:space="preserve">   —   420 €</w:t>
+      </w:r>
+    </w:p>
+    <w:p>
+      <w:pPr>
+        <w:pStyle w:val="ListParagraph"/>
+        <w:numPr>
+          <w:ilvl w:val="0"/>
+          <w:numId w:val="1"/>
+        </w:numPr>
+        <w:spacing w:before="0" w:after="60"/>
+        <w:rPr/>
+      </w:pPr>
+      <w:r>
+        <w:rPr/>
+        <w:t>Génération automatique de devis et factures au format PDF</w:t>
+      </w:r>
+    </w:p>
+    <w:p>
+      <w:pPr>
+        <w:pStyle w:val="ListParagraph"/>
+        <w:numPr>
+          <w:ilvl w:val="0"/>
+          <w:numId w:val="1"/>
+        </w:numPr>
+        <w:spacing w:before="0" w:after="60"/>
+        <w:rPr/>
+      </w:pPr>
+      <w:r>
+        <w:rPr/>
+        <w:t>Numérotation légale</w:t>
+      </w:r>
+    </w:p>
+    <w:p>
+      <w:pPr>
+        <w:pStyle w:val="ListParagraph"/>
+        <w:numPr>
+          <w:ilvl w:val="0"/>
+          <w:numId w:val="1"/>
+        </w:numPr>
+        <w:spacing w:before="0" w:after="60"/>
+        <w:rPr/>
+      </w:pPr>
+      <w:r>
+        <w:rPr/>
+        <w:t>Export pour la comptabilité</w:t>
       </w:r>
     </w:p>
     <w:p>
@@ -606,7 +733,7 @@
           <w:sz w:val="24"/>
           <w:szCs w:val="24"/>
         </w:rPr>
-        <w:t>6. Facturation</w:t>
+        <w:t>8. État des lieux &amp; gestion des dommages</w:t>
       </w:r>
       <w:r>
         <w:rPr>
@@ -616,52 +743,37 @@
           <w:sz w:val="24"/>
           <w:szCs w:val="24"/>
         </w:rPr>
-        <w:t xml:space="preserve">   —   420 €</w:t>
-      </w:r>
-    </w:p>
-    <w:p>
-      <w:pPr>
-        <w:pStyle w:val="ListParagraph"/>
-        <w:numPr>
-          <w:ilvl w:val="0"/>
-          <w:numId w:val="1"/>
-        </w:numPr>
-        <w:spacing w:before="0" w:after="60"/>
-        <w:rPr/>
-      </w:pPr>
-      <w:r>
-        <w:rPr/>
-        <w:t>Génération automatique de devis et factures au format PDF</w:t>
-      </w:r>
-    </w:p>
-    <w:p>
-      <w:pPr>
-        <w:pStyle w:val="ListParagraph"/>
-        <w:numPr>
-          <w:ilvl w:val="0"/>
-          <w:numId w:val="1"/>
-        </w:numPr>
-        <w:spacing w:before="0" w:after="60"/>
-        <w:rPr/>
-      </w:pPr>
-      <w:r>
-        <w:rPr/>
-        <w:t>Numérotation légale</w:t>
-      </w:r>
-    </w:p>
-    <w:p>
-      <w:pPr>
-        <w:pStyle w:val="ListParagraph"/>
-        <w:numPr>
-          <w:ilvl w:val="0"/>
-          <w:numId w:val="1"/>
-        </w:numPr>
-        <w:spacing w:before="0" w:after="60"/>
-        <w:rPr/>
-      </w:pPr>
-      <w:r>
-        <w:rPr/>
-        <w:t>Export pour la comptabilité</w:t>
+        <w:t xml:space="preserve">   —   450 €</w:t>
+      </w:r>
+    </w:p>
+    <w:p>
+      <w:pPr>
+        <w:pStyle w:val="ListParagraph"/>
+        <w:numPr>
+          <w:ilvl w:val="0"/>
+          <w:numId w:val="1"/>
+        </w:numPr>
+        <w:spacing w:before="0" w:after="60"/>
+        <w:rPr/>
+      </w:pPr>
+      <w:r>
+        <w:rPr/>
+        <w:t>Constat de retour — méthode à confirmer avec le client (photos et/ou checklist)</w:t>
+      </w:r>
+    </w:p>
+    <w:p>
+      <w:pPr>
+        <w:pStyle w:val="ListParagraph"/>
+        <w:numPr>
+          <w:ilvl w:val="0"/>
+          <w:numId w:val="1"/>
+        </w:numPr>
+        <w:spacing w:before="0" w:after="60"/>
+        <w:rPr/>
+      </w:pPr>
+      <w:r>
+        <w:rPr/>
+        <w:t>Prélèvement partiel ou total sur la caution en cas de dommage ou de pièce manquante</w:t>
       </w:r>
     </w:p>
     <w:p>
@@ -677,7 +789,7 @@
           <w:sz w:val="24"/>
           <w:szCs w:val="24"/>
         </w:rPr>
-        <w:t>7. Contrat de location / conditions générales</w:t>
+        <w:t>9. Notifications automatisées</w:t>
       </w:r>
       <w:r>
         <w:rPr>
@@ -702,22 +814,37 @@
       </w:pPr>
       <w:r>
         <w:rPr/>
-        <w:t>Conditions générales de location intégrées au tunnel de réservation</w:t>
-      </w:r>
-    </w:p>
-    <w:p>
-      <w:pPr>
-        <w:pStyle w:val="ListParagraph"/>
-        <w:numPr>
-          <w:ilvl w:val="0"/>
-          <w:numId w:val="1"/>
-        </w:numPr>
-        <w:spacing w:before="0" w:after="60"/>
-        <w:rPr/>
-      </w:pPr>
-      <w:r>
-        <w:rPr/>
-        <w:t>Acceptation obligatoire avant validation de la commande</w:t>
+        <w:t>Email de confirmation de réservation</w:t>
+      </w:r>
+    </w:p>
+    <w:p>
+      <w:pPr>
+        <w:pStyle w:val="ListParagraph"/>
+        <w:numPr>
+          <w:ilvl w:val="0"/>
+          <w:numId w:val="1"/>
+        </w:numPr>
+        <w:spacing w:before="0" w:after="60"/>
+        <w:rPr/>
+      </w:pPr>
+      <w:r>
+        <w:rPr/>
+        <w:t>Rappel avant la date de retour</w:t>
+      </w:r>
+    </w:p>
+    <w:p>
+      <w:pPr>
+        <w:pStyle w:val="ListParagraph"/>
+        <w:numPr>
+          <w:ilvl w:val="0"/>
+          <w:numId w:val="1"/>
+        </w:numPr>
+        <w:spacing w:before="0" w:after="60"/>
+        <w:rPr/>
+      </w:pPr>
+      <w:r>
+        <w:rPr/>
+        <w:t>Relance en cas de retard</w:t>
       </w:r>
     </w:p>
     <w:p>
@@ -733,7 +860,7 @@
           <w:sz w:val="24"/>
           <w:szCs w:val="24"/>
         </w:rPr>
-        <w:t>8. État des lieux &amp; gestion des dommages</w:t>
+        <w:t>10. Back-office &amp; reporting</w:t>
       </w:r>
       <w:r>
         <w:rPr>
@@ -758,22 +885,37 @@
       </w:pPr>
       <w:r>
         <w:rPr/>
-        <w:t>Constat de retour — méthode à confirmer avec le client (photos et/ou checklist)</w:t>
-      </w:r>
-    </w:p>
-    <w:p>
-      <w:pPr>
-        <w:pStyle w:val="ListParagraph"/>
-        <w:numPr>
-          <w:ilvl w:val="0"/>
-          <w:numId w:val="1"/>
-        </w:numPr>
-        <w:spacing w:before="0" w:after="60"/>
-        <w:rPr/>
-      </w:pPr>
-      <w:r>
-        <w:rPr/>
-        <w:t>Prélèvement partiel ou total sur la caution en cas de dommage ou de pièce manquante</w:t>
+        <w:t>Vue d'ensemble des locations en cours</w:t>
+      </w:r>
+    </w:p>
+    <w:p>
+      <w:pPr>
+        <w:pStyle w:val="ListParagraph"/>
+        <w:numPr>
+          <w:ilvl w:val="0"/>
+          <w:numId w:val="1"/>
+        </w:numPr>
+        <w:spacing w:before="0" w:after="60"/>
+        <w:rPr/>
+      </w:pPr>
+      <w:r>
+        <w:rPr/>
+        <w:t>Suivi du stock et du chiffre d'affaires</w:t>
+      </w:r>
+    </w:p>
+    <w:p>
+      <w:pPr>
+        <w:pStyle w:val="ListParagraph"/>
+        <w:numPr>
+          <w:ilvl w:val="0"/>
+          <w:numId w:val="1"/>
+        </w:numPr>
+        <w:spacing w:before="0" w:after="60"/>
+        <w:rPr/>
+      </w:pPr>
+      <w:r>
+        <w:rPr/>
+        <w:t>Exports de données</w:t>
       </w:r>
     </w:p>
     <w:p>
@@ -789,205 +931,7 @@
           <w:sz w:val="24"/>
           <w:szCs w:val="24"/>
         </w:rPr>
-        <w:t>9. Notifications automatisées</w:t>
-      </w:r>
-      <w:r>
-        <w:rPr>
-          <w:b/>
-          <w:bCs/>
-          <w:color w:val="1F5C3B"/>
-          <w:sz w:val="24"/>
-          <w:szCs w:val="24"/>
-        </w:rPr>
-        <w:t xml:space="preserve">   —   300 €</w:t>
-      </w:r>
-    </w:p>
-    <w:p>
-      <w:pPr>
-        <w:pStyle w:val="ListParagraph"/>
-        <w:numPr>
-          <w:ilvl w:val="0"/>
-          <w:numId w:val="1"/>
-        </w:numPr>
-        <w:spacing w:before="0" w:after="60"/>
-        <w:rPr/>
-      </w:pPr>
-      <w:r>
-        <w:rPr/>
-        <w:t>Email de confirmation de réservation</w:t>
-      </w:r>
-    </w:p>
-    <w:p>
-      <w:pPr>
-        <w:pStyle w:val="ListParagraph"/>
-        <w:numPr>
-          <w:ilvl w:val="0"/>
-          <w:numId w:val="1"/>
-        </w:numPr>
-        <w:spacing w:before="0" w:after="60"/>
-        <w:rPr/>
-      </w:pPr>
-      <w:r>
-        <w:rPr/>
-        <w:t>Rappel avant la date de retour</w:t>
-      </w:r>
-    </w:p>
-    <w:p>
-      <w:pPr>
-        <w:pStyle w:val="ListParagraph"/>
-        <w:numPr>
-          <w:ilvl w:val="0"/>
-          <w:numId w:val="1"/>
-        </w:numPr>
-        <w:spacing w:before="0" w:after="60"/>
-        <w:rPr/>
-      </w:pPr>
-      <w:r>
-        <w:rPr/>
-        <w:t>Relance en cas de retard</w:t>
-      </w:r>
-    </w:p>
-    <w:p>
-      <w:pPr>
-        <w:pStyle w:val="Normal"/>
-        <w:spacing w:before="260" w:after="80"/>
-        <w:rPr/>
-      </w:pPr>
-      <w:r>
-        <w:rPr>
-          <w:b/>
-          <w:bCs/>
-          <w:sz w:val="24"/>
-          <w:szCs w:val="24"/>
-        </w:rPr>
-        <w:t>10. Back-office &amp; reporting</w:t>
-      </w:r>
-      <w:r>
-        <w:rPr>
-          <w:b/>
-          <w:bCs/>
-          <w:color w:val="1F5C3B"/>
-          <w:sz w:val="24"/>
-          <w:szCs w:val="24"/>
-        </w:rPr>
-        <w:t xml:space="preserve">   —   450 €</w:t>
-      </w:r>
-    </w:p>
-    <w:p>
-      <w:pPr>
-        <w:pStyle w:val="ListParagraph"/>
-        <w:numPr>
-          <w:ilvl w:val="0"/>
-          <w:numId w:val="1"/>
-        </w:numPr>
-        <w:spacing w:before="0" w:after="60"/>
-        <w:rPr/>
-      </w:pPr>
-      <w:r>
-        <w:rPr/>
-        <w:t>Vue d'ensemble des locations en cours</w:t>
-      </w:r>
-    </w:p>
-    <w:p>
-      <w:pPr>
-        <w:pStyle w:val="ListParagraph"/>
-        <w:numPr>
-          <w:ilvl w:val="0"/>
-          <w:numId w:val="1"/>
-        </w:numPr>
-        <w:spacing w:before="0" w:after="60"/>
-        <w:rPr/>
-      </w:pPr>
-      <w:r>
-        <w:rPr/>
-        <w:t>Suivi du stock et du chiffre d'affaires</w:t>
-      </w:r>
-    </w:p>
-    <w:p>
-      <w:pPr>
-        <w:pStyle w:val="ListParagraph"/>
-        <w:numPr>
-          <w:ilvl w:val="0"/>
-          <w:numId w:val="1"/>
-        </w:numPr>
-        <w:spacing w:before="0" w:after="60"/>
-        <w:rPr/>
-      </w:pPr>
-      <w:r>
-        <w:rPr/>
-        <w:t>Exports de données</w:t>
-      </w:r>
-    </w:p>
-    <w:p>
-      <w:pPr>
-        <w:pStyle w:val="Normal"/>
-        <w:spacing w:before="260" w:after="80"/>
-        <w:rPr/>
-      </w:pPr>
-      <w:r>
-        <w:rPr>
-          <w:b/>
-          <w:bCs/>
-          <w:sz w:val="24"/>
-          <w:szCs w:val="24"/>
-        </w:rPr>
-        <w:t>11. Espace client en ligne</w:t>
-      </w:r>
-      <w:r>
-        <w:rPr>
-          <w:b/>
-          <w:bCs/>
-          <w:color w:val="1F5C3B"/>
-          <w:sz w:val="24"/>
-          <w:szCs w:val="24"/>
-        </w:rPr>
-        <w:t xml:space="preserve">   —   120 €</w:t>
-      </w:r>
-    </w:p>
-    <w:p>
-      <w:pPr>
-        <w:pStyle w:val="ListParagraph"/>
-        <w:numPr>
-          <w:ilvl w:val="0"/>
-          <w:numId w:val="1"/>
-        </w:numPr>
-        <w:spacing w:before="0" w:after="60"/>
-        <w:rPr/>
-      </w:pPr>
-      <w:r>
-        <w:rPr/>
-        <w:t>Page dédiée où le client consulte lui-même son historique et ses factures, sans passer par vous</w:t>
-      </w:r>
-    </w:p>
-    <w:p>
-      <w:pPr>
-        <w:pStyle w:val="ListParagraph"/>
-        <w:numPr>
-          <w:ilvl w:val="0"/>
-          <w:numId w:val="1"/>
-        </w:numPr>
-        <w:spacing w:before="0" w:after="60"/>
-        <w:rPr/>
-      </w:pPr>
-      <w:r>
-        <w:rPr/>
-        <w:t>(l'authentification de base est déjà couverte par le module 2 — ce module n'ajoute que la page de consultation)</w:t>
-      </w:r>
-    </w:p>
-    <w:p>
-      <w:pPr>
-        <w:pStyle w:val="Normal"/>
-        <w:spacing w:before="260" w:after="80"/>
-        <w:rPr/>
-      </w:pPr>
-      <w:r>
-        <w:rPr>
-          <w:b/>
-          <w:bCs/>
-          <w:sz w:val="24"/>
-          <w:szCs w:val="24"/>
-        </w:rPr>
-        <w:t>12. Intégration, tests, déploiement, formation</w:t>
+        <w:t>11. Intégration, tests, déploiement, formation</w:t>
       </w:r>
       <w:r>
         <w:rPr>

</xml_diff>

<commit_message>
docs: retirer le suivi des colis du module catalogue & stock
Sans objet en V1 (100% remise en main propre, pas de livraison).

Co-Authored-By: Claude Sonnet 5 <noreply@anthropic.com>
</commit_message>
<xml_diff>
--- a/docs/projet-plateforme-location/devis-set-et-brique.docx
+++ b/docs/projet-plateforme-location/devis-set-et-brique.docx
@@ -266,21 +266,6 @@
     </w:p>
     <w:p>
       <w:pPr>
-        <w:pStyle w:val="ListParagraph"/>
-        <w:numPr>
-          <w:ilvl w:val="0"/>
-          <w:numId w:val="1"/>
-        </w:numPr>
-        <w:spacing w:before="0" w:after="60"/>
-        <w:rPr/>
-      </w:pPr>
-      <w:r>
-        <w:rPr/>
-        <w:t>Suivi des colis envoyés / reçus (le cas échéant)</w:t>
-      </w:r>
-    </w:p>
-    <w:p>
-      <w:pPr>
         <w:pStyle w:val="Normal"/>
         <w:spacing w:before="260" w:after="80"/>
         <w:rPr/>

</xml_diff>

<commit_message>
docs: retirer l'option d'assurance additionnelle du devis
La caution (pré-autorisation, jamais débitée sauf litige) reste la
seule protection ; pas d'option d'assurance complémentaire payante.

Co-Authored-By: Claude Sonnet 5 <noreply@anthropic.com>
</commit_message>
<xml_diff>
--- a/docs/projet-plateforme-location/devis-set-et-brique.docx
+++ b/docs/projet-plateforme-location/devis-set-et-brique.docx
@@ -489,22 +489,7 @@
       </w:pPr>
       <w:r>
         <w:rPr/>
-        <w:t>Gestion de la caution (pré-autorisation ou encaissement)</w:t>
-      </w:r>
-    </w:p>
-    <w:p>
-      <w:pPr>
-        <w:pStyle w:val="ListParagraph"/>
-        <w:numPr>
-          <w:ilvl w:val="0"/>
-          <w:numId w:val="1"/>
-        </w:numPr>
-        <w:spacing w:before="0" w:after="60"/>
-        <w:rPr/>
-      </w:pPr>
-      <w:r>
-        <w:rPr/>
-        <w:t>Option d'assurance / protection additionnelle</w:t>
+        <w:t>Gestion de la caution en pré-autorisation (jamais débitée, sauf litige)</w:t>
       </w:r>
     </w:p>
     <w:p>

</xml_diff>

<commit_message>
fix(devis): aligner le devis sur les dernières décisions de cadrage
Retire l'export comptable des modules 7 et 10 (reporté en V2, décidé
lors du cadrage technique mais pas encore répercuté dans le devis) et
remplace le texte périmé "méthode de constat à confirmer" (module 8)
par la méthode réellement décrite par la cliente (pesée par sachet/
couleur + vérification figurines et manuels), le footnote associé
étant devenu obsolète.

Co-Authored-By: Claude Sonnet 5 <noreply@anthropic.com>
</commit_message>
<xml_diff>
--- a/docs/projet-plateforme-location/devis-set-et-brique.docx
+++ b/docs/projet-plateforme-location/devis-set-et-brique.docx
@@ -677,21 +677,6 @@
     </w:p>
     <w:p>
       <w:pPr>
-        <w:pStyle w:val="ListParagraph"/>
-        <w:numPr>
-          <w:ilvl w:val="0"/>
-          <w:numId w:val="1"/>
-        </w:numPr>
-        <w:spacing w:before="0" w:after="60"/>
-        <w:rPr/>
-      </w:pPr>
-      <w:r>
-        <w:rPr/>
-        <w:t>Export pour la comptabilité</w:t>
-      </w:r>
-    </w:p>
-    <w:p>
-      <w:pPr>
         <w:pStyle w:val="Normal"/>
         <w:spacing w:before="260" w:after="80"/>
         <w:rPr/>
@@ -728,7 +713,7 @@
       </w:pPr>
       <w:r>
         <w:rPr/>
-        <w:t>Constat de retour — méthode à confirmer avec le client (photos et/ou checklist)</w:t>
+        <w:t>Constat de retour réalisé par Set et Brique (pesée des pièces par sachet/couleur, vérification des figurines et des manuels de montage officiels), généralement le soir même de la réception du set</w:t>
       </w:r>
     </w:p>
     <w:p>
@@ -875,21 +860,6 @@
     </w:p>
     <w:p>
       <w:pPr>
-        <w:pStyle w:val="ListParagraph"/>
-        <w:numPr>
-          <w:ilvl w:val="0"/>
-          <w:numId w:val="1"/>
-        </w:numPr>
-        <w:spacing w:before="0" w:after="60"/>
-        <w:rPr/>
-      </w:pPr>
-      <w:r>
-        <w:rPr/>
-        <w:t>Exports de données</w:t>
-      </w:r>
-    </w:p>
-    <w:p>
-      <w:pPr>
         <w:pStyle w:val="Normal"/>
         <w:spacing w:before="260" w:after="80"/>
         <w:rPr/>
@@ -957,23 +927,6 @@
       <w:r>
         <w:rPr/>
         <w:t>Formation à l'utilisation de l'outil</w:t>
-      </w:r>
-    </w:p>
-    <w:p>
-      <w:pPr>
-        <w:pStyle w:val="Normal"/>
-        <w:spacing w:before="100" w:after="200"/>
-        <w:rPr/>
-      </w:pPr>
-      <w:r>
-        <w:rPr>
-          <w:i/>
-          <w:iCs/>
-          <w:color w:val="777777"/>
-          <w:sz w:val="18"/>
-          <w:szCs w:val="18"/>
-        </w:rPr>
-        <w:t>* La méthode exacte de constat de retour (module 8) sera précisée avec vous avant le démarrage du développement, selon votre fonctionnement actuel.</w:t>
       </w:r>
     </w:p>
     <w:p>

</xml_diff>

<commit_message>
docs: intégrer les remontées de Madus (poids, photos, contrat auto, export ventes)
- Devis : module 6 mis à jour pour un contrat de location PDF généré
  automatiquement à chaque réservation (prix inchangé, 300 €, absorbé
  dans le forfait) ; module 10 enrichi d'un export simple des ventes
  par année civile, distinct de l'export comptable complet resté en V2.
- Spécification fonctionnelle : ajout de la règle sur le poids (non
  affiché côté client), de la définition de la "vente" comme nœud
  set/durée/client interrogeable en base, et de deux nouveaux points
  ouverts (nombre de photos par set, blocage de dates par Marion sur
  le planning).
- Récap client : ajout des deux nouvelles questions (photos, blocage
  de dates) et de la question caution/TPE déjà identifiée.

Co-Authored-By: Claude Sonnet 5 <noreply@anthropic.com>
</commit_message>
<xml_diff>
--- a/docs/projet-plateforme-location/devis-set-et-brique.docx
+++ b/docs/projet-plateforme-location/devis-set-et-brique.docx
@@ -601,7 +601,7 @@
       </w:pPr>
       <w:r>
         <w:rPr/>
-        <w:t>Conditions générales de location intégrées au tunnel de réservation</w:t>
+        <w:t>Génération automatique d'un contrat de location personnalisé (PDF) à chaque réservation, avec les mentions légales, le set, la durée, les dates et le montant</w:t>
       </w:r>
     </w:p>
     <w:p>
@@ -856,6 +856,21 @@
       <w:r>
         <w:rPr/>
         <w:t>Suivi du stock et du chiffre d'affaires</w:t>
+      </w:r>
+    </w:p>
+    <w:p>
+      <w:pPr>
+        <w:pStyle w:val="ListParagraph"/>
+        <w:numPr>
+          <w:ilvl w:val="0"/>
+          <w:numId w:val="1"/>
+        </w:numPr>
+        <w:spacing w:before="0" w:after="60"/>
+        <w:rPr/>
+      </w:pPr>
+      <w:r>
+        <w:rPr/>
+        <w:t>Export simple des ventes par année civile (hors export comptable complet, prévu en V2)</w:t>
       </w:r>
     </w:p>
     <w:p>

</xml_diff>

<commit_message>
feat(devis): ajouter le module Bons cadeaux (inclus, total inchangé)
Nouvelle demande de la cliente, absente du devis initial : vente de
bons cadeaux en ligne aux montants de la grille tarifaire (10/15/25/45€),
génération de code, utilisables comme moyen de paiement dans le tunnel
de réservation, suivi depuis le back-office. Inséré en module 6,
listé "Inclus" (les 11 autres modules et le total à 5 520 € ne
bougent pas), présenté comme rendu possible par la réutilisation des
modules Paiement Stripe et Tunnel de réservation.

Renumérotation des modules 6 à 11 en 7 à 12 dans le devis, la
spécification fonctionnelle et le README. Ajout de 6 questions
métier/légales pour Marion (correspondance exacte durée/montant,
solde restant, caractère nominatif, durée de validité légale,
remboursement, réutilisation comme avoir de compensation).

Co-Authored-By: Claude Sonnet 5 <noreply@anthropic.com>
</commit_message>
<xml_diff>
--- a/docs/projet-plateforme-location/devis-set-et-brique.docx
+++ b/docs/projet-plateforme-location/devis-set-et-brique.docx
@@ -576,7 +576,7 @@
           <w:sz w:val="24"/>
           <w:szCs w:val="24"/>
         </w:rPr>
-        <w:t>6. Contrat de location / conditions générales</w:t>
+        <w:t>6. Bons cadeaux</w:t>
       </w:r>
       <w:r>
         <w:rPr>
@@ -586,6 +586,107 @@
           <w:sz w:val="24"/>
           <w:szCs w:val="24"/>
         </w:rPr>
+        <w:t xml:space="preserve">   —   Inclus</w:t>
+      </w:r>
+    </w:p>
+    <w:p>
+      <w:pPr>
+        <w:pStyle w:val="ListParagraph"/>
+        <w:numPr>
+          <w:ilvl w:val="0"/>
+          <w:numId w:val="1"/>
+        </w:numPr>
+        <w:spacing w:before="0" w:after="60"/>
+        <w:rPr/>
+      </w:pPr>
+      <w:r>
+        <w:rPr/>
+        <w:t>Vente de bons cadeaux en ligne, aux montants correspondant à la grille tarifaire (10 € / 15 € / 25 € / 45 €)</w:t>
+      </w:r>
+    </w:p>
+    <w:p>
+      <w:pPr>
+        <w:pStyle w:val="ListParagraph"/>
+        <w:numPr>
+          <w:ilvl w:val="0"/>
+          <w:numId w:val="1"/>
+        </w:numPr>
+        <w:spacing w:before="0" w:after="60"/>
+        <w:rPr/>
+      </w:pPr>
+      <w:r>
+        <w:rPr/>
+        <w:t>Génération automatique d'un code unique par bon acheté, envoyé par email à l'acheteur</w:t>
+      </w:r>
+    </w:p>
+    <w:p>
+      <w:pPr>
+        <w:pStyle w:val="ListParagraph"/>
+        <w:numPr>
+          <w:ilvl w:val="0"/>
+          <w:numId w:val="1"/>
+        </w:numPr>
+        <w:spacing w:before="0" w:after="60"/>
+        <w:rPr/>
+      </w:pPr>
+      <w:r>
+        <w:rPr/>
+        <w:t>Utilisation du bon comme moyen de paiement dans le tunnel de réservation, au même titre que Stripe ou le TPE</w:t>
+      </w:r>
+    </w:p>
+    <w:p>
+      <w:pPr>
+        <w:pStyle w:val="ListParagraph"/>
+        <w:numPr>
+          <w:ilvl w:val="0"/>
+          <w:numId w:val="1"/>
+        </w:numPr>
+        <w:spacing w:before="0" w:after="60"/>
+        <w:rPr/>
+      </w:pPr>
+      <w:r>
+        <w:rPr/>
+        <w:t>Suivi des bons émis (valide / utilisé / expiré) depuis le back-office</w:t>
+      </w:r>
+    </w:p>
+    <w:p>
+      <w:pPr>
+        <w:pStyle w:val="ListParagraph"/>
+        <w:numPr>
+          <w:ilvl w:val="0"/>
+          <w:numId w:val="1"/>
+        </w:numPr>
+        <w:spacing w:before="0" w:after="60"/>
+        <w:rPr/>
+      </w:pPr>
+      <w:r>
+        <w:rPr/>
+        <w:t>Module rendu possible sans surcoût grâce à la réutilisation du paiement (module 4) et du tunnel de réservation (module 5) déjà développés</w:t>
+      </w:r>
+    </w:p>
+    <w:p>
+      <w:pPr>
+        <w:pStyle w:val="Normal"/>
+        <w:spacing w:before="260" w:after="80"/>
+        <w:rPr/>
+      </w:pPr>
+      <w:r>
+        <w:rPr>
+          <w:b/>
+          <w:bCs/>
+          <w:sz w:val="24"/>
+          <w:szCs w:val="24"/>
+        </w:rPr>
+        <w:t>7. Contrat de location / conditions générales</w:t>
+      </w:r>
+      <w:r>
+        <w:rPr>
+          <w:b/>
+          <w:bCs/>
+          <w:color w:val="1F5C3B"/>
+          <w:sz w:val="24"/>
+          <w:szCs w:val="24"/>
+        </w:rPr>
         <w:t xml:space="preserve">   —   300 €</w:t>
       </w:r>
     </w:p>
@@ -632,7 +733,7 @@
           <w:sz w:val="24"/>
           <w:szCs w:val="24"/>
         </w:rPr>
-        <w:t>7. Facturation</w:t>
+        <w:t>8. Facturation</w:t>
       </w:r>
       <w:r>
         <w:rPr>
@@ -688,7 +789,7 @@
           <w:sz w:val="24"/>
           <w:szCs w:val="24"/>
         </w:rPr>
-        <w:t>8. État des lieux &amp; gestion des dommages</w:t>
+        <w:t>9. État des lieux &amp; gestion des dommages</w:t>
       </w:r>
       <w:r>
         <w:rPr>
@@ -744,7 +845,7 @@
           <w:sz w:val="24"/>
           <w:szCs w:val="24"/>
         </w:rPr>
-        <w:t>9. Notifications automatisées</w:t>
+        <w:t>10. Notifications automatisées</w:t>
       </w:r>
       <w:r>
         <w:rPr>
@@ -815,7 +916,7 @@
           <w:sz w:val="24"/>
           <w:szCs w:val="24"/>
         </w:rPr>
-        <w:t>10. Back-office &amp; reporting</w:t>
+        <w:t>11. Back-office &amp; reporting</w:t>
       </w:r>
       <w:r>
         <w:rPr>
@@ -886,7 +987,7 @@
           <w:sz w:val="24"/>
           <w:szCs w:val="24"/>
         </w:rPr>
-        <w:t>11. Intégration, tests, déploiement, formation</w:t>
+        <w:t>12. Intégration, tests, déploiement, formation</w:t>
       </w:r>
       <w:r>
         <w:rPr>

</xml_diff>